<commit_message>
Nombre de la empresa: Ferreira Salud Digital S.R.L. en documentos, contrato, SENAPI y páginas legales
Co-Authored-By: Claude Opus 5.5 <noreply@anthropic.com>
Claude-Session: https://claude.ai/code/session_015MG6VeavRZnDbjYZyzDjvL
</commit_message>
<xml_diff>
--- a/docs/empresa/05-Terminos-de-uso-y-privacidad.docx
+++ b/docs/empresa/05-Terminos-de-uso-y-privacidad.docx
@@ -92,7 +92,7 @@
         <w:rPr>
           <w:shd w:fill="FFF176" w:color="auto" w:val="clear"/>
         </w:rPr>
-        <w:t xml:space="preserve">Nombre de la empresa</w:t>
+        <w:t>Ferreira Salud Digital S.R.L.</w:t>
       </w:r>
       <w:r>
         <w:t xml:space="preserve"> (el PROVEEDOR) bajo licencia de su autor, </w:t>
@@ -409,7 +409,7 @@
         <w:rPr>
           <w:shd w:fill="FFF176" w:color="auto" w:val="clear"/>
         </w:rPr>
-        <w:t xml:space="preserve">Nombre de la empresa</w:t>
+        <w:t>Ferreira Salud Digital S.R.L.</w:t>
       </w:r>
       <w:r>
         <w:t xml:space="preserve"> los guarda y procesa </w:t>
@@ -709,7 +709,7 @@
         <w:rPr>
           <w:shd w:fill="FFF176" w:color="auto" w:val="clear"/>
         </w:rPr>
-        <w:t xml:space="preserve">Nombre de la empresa</w:t>
+        <w:t>Ferreira Salud Digital S.R.L.</w:t>
       </w:r>
       <w:r>
         <w:t xml:space="preserve"> · </w:t>
@@ -732,6 +732,7 @@
     </w:p>
     <w:sectPr>
       <w:footerReference w:type="default" r:id="rId7"/>
+      <w:headerReference w:type="default" r:id="rId10"/>
       <w:pgSz w:w="11906" w:h="16838" w:orient="portrait"/>
       <w:pgMar w:top="1440" w:right="1440" w:bottom="1440" w:left="1440" w:header="708" w:footer="708" w:gutter="0"/>
       <w:pgNumType/>
@@ -848,6 +849,16 @@
 </w:footnotes>
 </file>
 
+<file path=word/header1.xml><?xml version="1.0" encoding="utf-8"?>
+<w:hdr xmlns:m="http://schemas.openxmlformats.org/officeDocument/2006/math" xmlns:mc="http://schemas.openxmlformats.org/markup-compatibility/2006" xmlns:mo="http://schemas.microsoft.com/office/mac/office/2008/main" xmlns:mv="urn:schemas-microsoft-com:mac:vml" xmlns:o="urn:schemas-microsoft-com:office:office" xmlns:r="http://schemas.openxmlformats.org/officeDocument/2006/relationships" xmlns:v="urn:schemas-microsoft-com:vml" xmlns:w10="urn:schemas-microsoft-com:office:word" xmlns:w14="http://schemas.microsoft.com/office/word/2010/wordml" xmlns:w="http://schemas.openxmlformats.org/wordprocessingml/2006/main" xmlns:wne="http://schemas.microsoft.com/office/word/2006/wordml" xmlns:wp14="http://schemas.microsoft.com/office/word/2010/wordprocessingDrawing" xmlns:wp="http://schemas.openxmlformats.org/drawingml/2006/wordprocessingDrawing" xmlns:wpc="http://schemas.microsoft.com/office/word/2010/wordprocessingCanvas" xmlns:wpg="http://schemas.microsoft.com/office/word/2010/wordprocessingGroup" xmlns:wpi="http://schemas.microsoft.com/office/word/2010/wordprocessingInk" xmlns:wps="http://schemas.microsoft.com/office/word/2010/wordprocessingShape" mc:Ignorable="w14 wp14">
+  <w:p>
+    <w:pPr>
+      <w:pStyle w:val="Header"/>
+    </w:pPr>
+  </w:p>
+</w:hdr>
+</file>
+
 <file path=word/numbering.xml><?xml version="1.0" encoding="utf-8"?>
 <w:numbering xmlns:wpc="http://schemas.microsoft.com/office/word/2010/wordprocessingCanvas" xmlns:mc="http://schemas.openxmlformats.org/markup-compatibility/2006" xmlns:o="urn:schemas-microsoft-com:office:office" xmlns:r="http://schemas.openxmlformats.org/officeDocument/2006/relationships" xmlns:m="http://schemas.openxmlformats.org/officeDocument/2006/math" xmlns:v="urn:schemas-microsoft-com:vml" xmlns:wp14="http://schemas.microsoft.com/office/word/2010/wordprocessingDrawing" xmlns:wp="http://schemas.openxmlformats.org/drawingml/2006/wordprocessingDrawing" xmlns:w10="urn:schemas-microsoft-com:office:word" xmlns:w="http://schemas.openxmlformats.org/wordprocessingml/2006/main" xmlns:w14="http://schemas.microsoft.com/office/word/2010/wordml" xmlns:w15="http://schemas.microsoft.com/office/word/2012/wordml" xmlns:wpg="http://schemas.microsoft.com/office/word/2010/wordprocessingGroup" xmlns:wpi="http://schemas.microsoft.com/office/word/2010/wordprocessingInk" xmlns:wne="http://schemas.microsoft.com/office/word/2006/wordml" xmlns:wps="http://schemas.microsoft.com/office/word/2010/wordprocessingShape" mc:Ignorable="w14 w15 wp14">
   <w:abstractNum w:abstractNumId="1" w15:restartNumberingAfterBreak="0">

</xml_diff>